<commit_message>
correcion en los templates PLANTILLA CARTA INSTRUCCIONES TRANSPORTE FAVORITA
</commit_message>
<xml_diff>
--- a/server/templates/transporte/PLANTILLA CARTA INSTRUCCIONES TRANSPORTE FAVORITA.docx
+++ b/server/templates/transporte/PLANTILLA CARTA INSTRUCCIONES TRANSPORTE FAVORITA.docx
@@ -262,25 +262,7 @@
                 <w:sz w:val="20"/>
                 <w:szCs w:val="20"/>
               </w:rPr>
-              <w:t>{</w:t>
-            </w:r>
-            <w:proofErr w:type="spellStart"/>
-            <w:r>
-              <w:rPr>
-                <w:rFonts w:ascii="Tahoma" w:eastAsia="Tahoma" w:hAnsi="Tahoma" w:cs="Tahoma"/>
-                <w:sz w:val="20"/>
-                <w:szCs w:val="20"/>
-              </w:rPr>
-              <w:t>tipoFruta</w:t>
-            </w:r>
-            <w:proofErr w:type="spellEnd"/>
-            <w:r>
-              <w:rPr>
-                <w:rFonts w:ascii="Tahoma" w:eastAsia="Tahoma" w:hAnsi="Tahoma" w:cs="Tahoma"/>
-                <w:sz w:val="20"/>
-                <w:szCs w:val="20"/>
-              </w:rPr>
-              <w:t>}</w:t>
+              <w:t>{tipoFruta}</w:t>
             </w:r>
           </w:p>
         </w:tc>
@@ -752,11 +734,20 @@
             <w:r>
               <w:rPr>
                 <w:rFonts w:ascii="Tahoma" w:eastAsia="Tahoma" w:hAnsi="Tahoma" w:cs="Tahoma"/>
+                <w:color w:val="000000"/>
+                <w:sz w:val="18"/>
+                <w:szCs w:val="18"/>
+              </w:rPr>
+              <w:t>PREFIJO DEL CONTENEDOR</w:t>
+            </w:r>
+            <w:r>
+              <w:rPr>
+                <w:rFonts w:ascii="Tahoma" w:eastAsia="Tahoma" w:hAnsi="Tahoma" w:cs="Tahoma"/>
                 <w:color w:val="000000" w:themeColor="text1"/>
                 <w:sz w:val="20"/>
                 <w:szCs w:val="20"/>
               </w:rPr>
-              <w:t>NUMERO CONTENEDOR:</w:t>
+              <w:t>:</w:t>
             </w:r>
           </w:p>
         </w:tc>
@@ -807,27 +798,7 @@
                 <w:sz w:val="20"/>
                 <w:szCs w:val="20"/>
               </w:rPr>
-              <w:t>{</w:t>
-            </w:r>
-            <w:proofErr w:type="spellStart"/>
-            <w:r>
-              <w:rPr>
-                <w:rFonts w:ascii="Tahoma" w:eastAsia="Tahoma" w:hAnsi="Tahoma" w:cs="Tahoma"/>
-                <w:color w:val="000000" w:themeColor="text1"/>
-                <w:sz w:val="20"/>
-                <w:szCs w:val="20"/>
-              </w:rPr>
-              <w:t>numeroContenedor</w:t>
-            </w:r>
-            <w:proofErr w:type="spellEnd"/>
-            <w:r>
-              <w:rPr>
-                <w:rFonts w:ascii="Tahoma" w:eastAsia="Tahoma" w:hAnsi="Tahoma" w:cs="Tahoma"/>
-                <w:color w:val="000000" w:themeColor="text1"/>
-                <w:sz w:val="20"/>
-                <w:szCs w:val="20"/>
-              </w:rPr>
-              <w:t>}</w:t>
+              <w:t>{numeroContenedor}</w:t>
             </w:r>
           </w:p>
         </w:tc>
@@ -1194,7 +1165,6 @@
         </w:rPr>
         <w:t>{</w:t>
       </w:r>
-      <w:proofErr w:type="spellStart"/>
       <w:r>
         <w:rPr>
           <w:rFonts w:ascii="Tahoma" w:eastAsia="Tahoma" w:hAnsi="Tahoma" w:cs="Tahoma"/>
@@ -1203,7 +1173,6 @@
         </w:rPr>
         <w:t>fecha_dia_escrito</w:t>
       </w:r>
-      <w:proofErr w:type="spellEnd"/>
       <w:r>
         <w:rPr>
           <w:rFonts w:ascii="Tahoma" w:eastAsia="Tahoma" w:hAnsi="Tahoma" w:cs="Tahoma"/>
@@ -1228,7 +1197,6 @@
         </w:rPr>
         <w:t>{</w:t>
       </w:r>
-      <w:proofErr w:type="spellStart"/>
       <w:r>
         <w:rPr>
           <w:rFonts w:ascii="Tahoma" w:eastAsia="Tahoma" w:hAnsi="Tahoma" w:cs="Tahoma"/>
@@ -1237,7 +1205,6 @@
         </w:rPr>
         <w:t>fecha_mes</w:t>
       </w:r>
-      <w:proofErr w:type="spellEnd"/>
       <w:r>
         <w:rPr>
           <w:rFonts w:ascii="Tahoma" w:eastAsia="Tahoma" w:hAnsi="Tahoma" w:cs="Tahoma"/>
@@ -1262,7 +1229,6 @@
         </w:rPr>
         <w:t>{</w:t>
       </w:r>
-      <w:proofErr w:type="spellStart"/>
       <w:r>
         <w:rPr>
           <w:rFonts w:ascii="Tahoma" w:eastAsia="Tahoma" w:hAnsi="Tahoma" w:cs="Tahoma"/>
@@ -1271,7 +1237,6 @@
         </w:rPr>
         <w:t>fecha_anio</w:t>
       </w:r>
-      <w:proofErr w:type="spellEnd"/>
       <w:r>
         <w:rPr>
           <w:rFonts w:ascii="Tahoma" w:eastAsia="Tahoma" w:hAnsi="Tahoma" w:cs="Tahoma"/>
@@ -1664,7 +1629,7 @@
         </mc:Choice>
         <mc:Fallback>
           <w:pict>
-            <v:shape w14:anchorId="7D2EC4ED" id="Graphic 3" o:spid="_x0000_s1026" style="position:absolute;margin-left:52.6pt;margin-top:-4.3pt;width:506.85pt;height:.1pt;z-index:251659264;visibility:visible;mso-wrap-style:square;mso-wrap-distance-left:0;mso-wrap-distance-top:0;mso-wrap-distance-right:0;mso-wrap-distance-bottom:0;mso-position-horizontal:absolute;mso-position-horizontal-relative:page;mso-position-vertical:absolute;mso-position-vertical-relative:text;v-text-anchor:top" coordsize="6436995,1270" o:gfxdata="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" path="m,l6436475,e" filled="f" strokeweight=".26456mm">
+            <v:shape w14:anchorId="18A6DBD8" id="Graphic 3" o:spid="_x0000_s1026" style="position:absolute;margin-left:52.6pt;margin-top:-4.3pt;width:506.85pt;height:.1pt;z-index:251659264;visibility:visible;mso-wrap-style:square;mso-wrap-distance-left:0;mso-wrap-distance-top:0;mso-wrap-distance-right:0;mso-wrap-distance-bottom:0;mso-position-horizontal:absolute;mso-position-horizontal-relative:page;mso-position-vertical:absolute;mso-position-vertical-relative:text;v-text-anchor:top" coordsize="6436995,1270" o:gfxdata="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" path="m,l6436475,e" filled="f" strokeweight=".26456mm">
               <v:path arrowok="t"/>
               <w10:wrap anchorx="page"/>
             </v:shape>

</xml_diff>